<commit_message>
Update N4 title — 'Your Brain Decided. You Just Signed the Receipt.'
Replaces 84/100 title with stronger emotional trigger targeting loss of
agency and identity. Estimated ~90-94/100 VidIQ pending credit recharge.

https://claude.ai/code/session_01L4D3BJE5wxKGrRneu3Lana
</commit_message>
<xml_diff>
--- a/N4_Prepublish_Checklist.docx
+++ b/N4_Prepublish_Checklist.docx
@@ -83,7 +83,7 @@
           <w:color w:val="B02A2A"/>
           <w:sz w:val="22"/>
         </w:rPr>
-        <w:t>── 2. TÍTULO — 84/100 VidIQ ──</w:t>
+        <w:t>── 2. TÍTULO — ~90-94/100 VidIQ (pendiente confirmar con créditos) ──</w:t>
       </w:r>
     </w:p>
     <w:p>
@@ -103,7 +103,7 @@
           <w:color w:val="2C3E50"/>
           <w:sz w:val="24"/>
         </w:rPr>
-        <w:t>Your Brain Decides to Buy 200 Milliseconds Before You Do</w:t>
+        <w:t>Your Brain Decided. You Just Signed the Receipt.</w:t>
       </w:r>
     </w:p>
     <w:p>
@@ -116,7 +116,7 @@
           <w:color w:val="777777"/>
           <w:sz w:val="16"/>
         </w:rPr>
-        <w:t>Descartados:  'The Hidden Reason You Can't Stop Spending (It's Not Willpower)' = 79/100  |  'Why Buying Feels Better Than Having — And What It's Costing You' = 73/100</w:t>
+        <w:t>Descartados:  'Your Brain Decides to Buy 200 Milliseconds Before You Do' = 84/100  |  'You Haven't Made a Free Purchase in Your Life' ~87-90  |  'Your Brain Buys Everything. You Just Pay for It.' ~85-88</w:t>
       </w:r>
     </w:p>
     <w:p>
@@ -129,7 +129,7 @@
           <w:color w:val="777777"/>
           <w:sz w:val="16"/>
         </w:rPr>
-        <w:t>Histórico canal:  N3 (V6) = 92/100  ·  N2 (V9) = 86/100  ·  N4 = 84/100</w:t>
+        <w:t>Histórico canal:  N3 (V6) = 92/100  ·  N2 (V9) = 86/100  ·  N4 anterior = 84/100  →  nuevo estimado ~90-94</w:t>
       </w:r>
     </w:p>
     <w:p>
@@ -991,7 +991,7 @@
         <w:rPr>
           <w:sz w:val="20"/>
         </w:rPr>
-        <w:t>☐  Título:         Your Brain Decides to Buy 200 Milliseconds Before You Do</w:t>
+        <w:t>☐  Título:         Your Brain Decided. You Just Signed the Receipt.</w:t>
       </w:r>
     </w:p>
     <w:p>
@@ -1934,7 +1934,7 @@
           <w:color w:val="777777"/>
           <w:sz w:val="16"/>
         </w:rPr>
-        <w:t>NEUROCENTS · N4 · PRE-PUBLISH CHECKLIST · Título 84/100 VidIQ · Tags testeados</w:t>
+        <w:t>NEUROCENTS · N4 · PRE-PUBLISH CHECKLIST · Título ~90-94/100 VidIQ estimado · Tags testeados</w:t>
       </w:r>
     </w:p>
     <w:sectPr>

</xml_diff>